<commit_message>
Trim Exercise 2 output excerpt and state word count up front
</commit_message>
<xml_diff>
--- a/submission.docx
+++ b/submission.docx
@@ -8,6 +8,17 @@
       </w:pPr>
       <w:r>
         <w:t xml:space="preserve">Coinbase SEA: Insights to Impact Challenge</w:t>
+      </w:r>
+    </w:p>
+    <w:p>
+      <w:pPr>
+        <w:pStyle w:val="Normal"/>
+      </w:pPr>
+      <w:r>
+        <w:rPr>
+          <w:i/>
+        </w:rPr>
+        <w:t xml:space="preserve">Word count: about 1,450 words, excluding code blocks (per the 1,500-word rule).</w:t>
       </w:r>
     </w:p>
     <w:p>
@@ -905,17 +916,6 @@
         <w:spacing w:before="0" w:after="0" w:line="240" w:lineRule="auto"/>
       </w:pPr>
       <w:r>
-        <w:t xml:space="preserve">  -- pivoted = MIN(IFF(step=...)) per user; accounts = LOWER(TRIM(user_uuid)), 1 row/user</w:t>
-      </w:r>
-    </w:p>
-    <w:p>
-      <w:pPr>
-        <w:pStyle w:val="Code"/>
-        <w:keepNext/>
-        <w:shd w:val="clear" w:color="auto" w:fill="F6F8FA"/>
-        <w:spacing w:before="0" w:after="0" w:line="240" w:lineRule="auto"/>
-      </w:pPr>
-      <w:r>
         <w:t xml:space="preserve">  -- full model: ex1/fct_onboarding_funnel.sql; SQLite port + 31 tests: ex1/sqlite, ex1/tests</w:t>
       </w:r>
     </w:p>
@@ -1542,6 +1542,7 @@
     <w:p>
       <w:pPr>
         <w:pStyle w:val="Code"/>
+        <w:keepNext/>
         <w:shd w:val="clear" w:color="auto" w:fill="F6F8FA"/>
         <w:spacing w:before="120" w:after="0" w:line="240" w:lineRule="auto"/>
       </w:pPr>
@@ -1552,6 +1553,7 @@
     <w:p>
       <w:pPr>
         <w:pStyle w:val="Code"/>
+        <w:keepNext/>
         <w:shd w:val="clear" w:color="auto" w:fill="F6F8FA"/>
         <w:spacing w:before="0" w:after="0" w:line="240" w:lineRule="auto"/>
       </w:pPr>
@@ -1562,26 +1564,7 @@
     <w:p>
       <w:pPr>
         <w:pStyle w:val="Code"/>
-        <w:shd w:val="clear" w:color="auto" w:fill="F6F8FA"/>
-        <w:spacing w:before="0" w:after="0" w:line="240" w:lineRule="auto"/>
-      </w:pPr>
-      <w:r>
-        <w:t xml:space="preserve">   columns that differ within a group: {'ingest_batch_id': 4000}</w:t>
-      </w:r>
-    </w:p>
-    <w:p>
-      <w:pPr>
-        <w:pStyle w:val="Code"/>
-        <w:shd w:val="clear" w:color="auto" w:fill="F6F8FA"/>
-        <w:spacing w:before="0" w:after="0" w:line="240" w:lineRule="auto"/>
-      </w:pPr>
-      <w:r>
-        <w:t xml:space="preserve">   batches holding the extra rows: [('b30_retry', 726), ('b31_retry', 684), ('b29_retry', 657)]</w:t>
-      </w:r>
-    </w:p>
-    <w:p>
-      <w:pPr>
-        <w:pStyle w:val="Code"/>
+        <w:keepNext/>
         <w:shd w:val="clear" w:color="auto" w:fill="F6F8FA"/>
         <w:spacing w:before="0" w:after="0" w:line="240" w:lineRule="auto"/>
       </w:pPr>
@@ -1592,46 +1575,7 @@
     <w:p>
       <w:pPr>
         <w:pStyle w:val="Code"/>
-        <w:shd w:val="clear" w:color="auto" w:fill="F6F8FA"/>
-        <w:spacing w:before="0" w:after="0" w:line="240" w:lineRule="auto"/>
-      </w:pPr>
-      <w:r>
-        <w:t xml:space="preserve">A: none</w:t>
-      </w:r>
-    </w:p>
-    <w:p>
-      <w:pPr>
-        <w:pStyle w:val="Code"/>
-        <w:shd w:val="clear" w:color="auto" w:fill="F6F8FA"/>
-        <w:spacing w:before="0" w:after="0" w:line="240" w:lineRule="auto"/>
-      </w:pPr>
-      <w:r>
-        <w:t xml:space="preserve">B: none</w:t>
-      </w:r>
-    </w:p>
-    <w:p>
-      <w:pPr>
-        <w:pStyle w:val="Code"/>
-        <w:shd w:val="clear" w:color="auto" w:fill="F6F8FA"/>
-        <w:spacing w:before="0" w:after="0" w:line="240" w:lineRule="auto"/>
-      </w:pPr>
-      <w:r>
-        <w:t xml:space="preserve">== 2. Grain check for 2026-09-24: rows vs distinct users, and UTC time range ==</w:t>
-      </w:r>
-    </w:p>
-    <w:p>
-      <w:pPr>
-        <w:pStyle w:val="Code"/>
-        <w:shd w:val="clear" w:color="auto" w:fill="F6F8FA"/>
-        <w:spacing w:before="0" w:after="0" w:line="240" w:lineRule="auto"/>
-      </w:pPr>
-      <w:r>
-        <w:t xml:space="preserve">A:  52,000 rows |  52,000 distinct | 09-24 00:00 -&gt; 09-24 23:59 UTC</w:t>
-      </w:r>
-    </w:p>
-    <w:p>
-      <w:pPr>
-        <w:pStyle w:val="Code"/>
+        <w:keepNext/>
         <w:shd w:val="clear" w:color="auto" w:fill="F6F8FA"/>
         <w:spacing w:before="0" w:after="0" w:line="240" w:lineRule="auto"/>
       </w:pPr>
@@ -1642,66 +1586,7 @@
     <w:p>
       <w:pPr>
         <w:pStyle w:val="Code"/>
-        <w:shd w:val="clear" w:color="auto" w:fill="F6F8FA"/>
-        <w:spacing w:before="0" w:after="0" w:line="240" w:lineRule="auto"/>
-      </w:pPr>
-      <w:r>
-        <w:t xml:space="preserve">C:  57,000 rows |  52,000 distinct | 09-24 00:00 -&gt; 09-24 23:59 UTC</w:t>
-      </w:r>
-    </w:p>
-    <w:p>
-      <w:pPr>
-        <w:pStyle w:val="Code"/>
-        <w:shd w:val="clear" w:color="auto" w:fill="F6F8FA"/>
-        <w:spacing w:before="0" w:after="0" w:line="240" w:lineRule="auto"/>
-      </w:pPr>
-      <w:r>
-        <w:t xml:space="preserve">== 3. Overlap of distinct user_ids ==</w:t>
-      </w:r>
-    </w:p>
-    <w:p>
-      <w:pPr>
-        <w:pStyle w:val="Code"/>
-        <w:shd w:val="clear" w:color="auto" w:fill="F6F8FA"/>
-        <w:spacing w:before="0" w:after="0" w:line="240" w:lineRule="auto"/>
-      </w:pPr>
-      <w:r>
-        <w:t xml:space="preserve">  in A+B+C       32,500</w:t>
-      </w:r>
-    </w:p>
-    <w:p>
-      <w:pPr>
-        <w:pStyle w:val="Code"/>
-        <w:shd w:val="clear" w:color="auto" w:fill="F6F8FA"/>
-        <w:spacing w:before="0" w:after="0" w:line="240" w:lineRule="auto"/>
-      </w:pPr>
-      <w:r>
-        <w:t xml:space="preserve">  in A+C only    19,500</w:t>
-      </w:r>
-    </w:p>
-    <w:p>
-      <w:pPr>
-        <w:pStyle w:val="Code"/>
-        <w:shd w:val="clear" w:color="auto" w:fill="F6F8FA"/>
-        <w:spacing w:before="0" w:after="0" w:line="240" w:lineRule="auto"/>
-      </w:pPr>
-      <w:r>
-        <w:t xml:space="preserve">  in B only      12,500</w:t>
-      </w:r>
-    </w:p>
-    <w:p>
-      <w:pPr>
-        <w:pStyle w:val="Code"/>
-        <w:shd w:val="clear" w:color="auto" w:fill="F6F8FA"/>
-        <w:spacing w:before="0" w:after="0" w:line="240" w:lineRule="auto"/>
-      </w:pPr>
-      <w:r>
-        <w:t xml:space="preserve">== 4. Explain every A-vs-B difference (anything left over is UNEXPLAINED) ==</w:t>
-      </w:r>
-    </w:p>
-    <w:p>
-      <w:pPr>
-        <w:pStyle w:val="Code"/>
+        <w:keepNext/>
         <w:shd w:val="clear" w:color="auto" w:fill="F6F8FA"/>
         <w:spacing w:before="0" w:after="0" w:line="240" w:lineRule="auto"/>
       </w:pPr>
@@ -1712,6 +1597,7 @@
     <w:p>
       <w:pPr>
         <w:pStyle w:val="Code"/>
+        <w:keepNext/>
         <w:shd w:val="clear" w:color="auto" w:fill="F6F8FA"/>
         <w:spacing w:before="0" w:after="0" w:line="240" w:lineRule="auto"/>
       </w:pPr>
@@ -1722,6 +1608,7 @@
     <w:p>
       <w:pPr>
         <w:pStyle w:val="Code"/>
+        <w:keepNext/>
         <w:shd w:val="clear" w:color="auto" w:fill="F6F8FA"/>
         <w:spacing w:before="0" w:after="0" w:line="240" w:lineRule="auto"/>
       </w:pPr>
@@ -1732,6 +1619,7 @@
     <w:p>
       <w:pPr>
         <w:pStyle w:val="Code"/>
+        <w:keepNext/>
         <w:shd w:val="clear" w:color="auto" w:fill="F6F8FA"/>
         <w:spacing w:before="0" w:after="0" w:line="240" w:lineRule="auto"/>
       </w:pPr>
@@ -1742,6 +1630,7 @@
     <w:p>
       <w:pPr>
         <w:pStyle w:val="Code"/>
+        <w:keepNext/>
         <w:shd w:val="clear" w:color="auto" w:fill="F6F8FA"/>
         <w:spacing w:before="0" w:after="0" w:line="240" w:lineRule="auto"/>
       </w:pPr>
@@ -1752,6 +1641,7 @@
     <w:p>
       <w:pPr>
         <w:pStyle w:val="Code"/>
+        <w:keepNext/>
         <w:shd w:val="clear" w:color="auto" w:fill="F6F8FA"/>
         <w:spacing w:before="0" w:after="0" w:line="240" w:lineRule="auto"/>
       </w:pPr>
@@ -1762,6 +1652,7 @@
     <w:p>
       <w:pPr>
         <w:pStyle w:val="Code"/>
+        <w:keepNext/>
         <w:shd w:val="clear" w:color="auto" w:fill="F6F8FA"/>
         <w:spacing w:before="0" w:after="0" w:line="240" w:lineRule="auto"/>
       </w:pPr>
@@ -1773,30 +1664,10 @@
       <w:pPr>
         <w:pStyle w:val="Code"/>
         <w:shd w:val="clear" w:color="auto" w:fill="F6F8FA"/>
-        <w:spacing w:before="0" w:after="0" w:line="240" w:lineRule="auto"/>
-      </w:pPr>
-      <w:r>
-        <w:t xml:space="preserve">== 5. Candidate single number ==</w:t>
-      </w:r>
-    </w:p>
-    <w:p>
-      <w:pPr>
-        <w:pStyle w:val="Code"/>
-        <w:shd w:val="clear" w:color="auto" w:fill="F6F8FA"/>
-        <w:spacing w:before="0" w:after="0" w:line="240" w:lineRule="auto"/>
+        <w:spacing w:before="0" w:after="160" w:line="240" w:lineRule="auto"/>
       </w:pPr>
       <w:r>
         <w:t xml:space="preserve">Accounts created, UTC day, excl. test/internal, deduped: 50,000</w:t>
-      </w:r>
-    </w:p>
-    <w:p>
-      <w:pPr>
-        <w:pStyle w:val="Code"/>
-        <w:shd w:val="clear" w:color="auto" w:fill="F6F8FA"/>
-        <w:spacing w:before="0" w:after="160" w:line="240" w:lineRule="auto"/>
-      </w:pPr>
-      <w:r>
-        <w:t xml:space="preserve">  of which email-verified: 43,293</w:t>
       </w:r>
     </w:p>
     <w:p>

</xml_diff>

<commit_message>
Apply blind-review fixes: PM funnel query, clearer Ex2 framing and Ex3 caveats
</commit_message>
<xml_diff>
--- a/submission.docx
+++ b/submission.docx
@@ -16,15 +16,13 @@
       </w:pPr>
       <w:r>
         <w:rPr>
-          <w:i/>
-        </w:rPr>
-        <w:t xml:space="preserve">Word count: about 1,450 words, excluding code blocks (per the 1,500-word rule).</w:t>
-      </w:r>
-    </w:p>
-    <w:p>
-      <w:pPr>
-        <w:pStyle w:val="Normal"/>
-      </w:pPr>
+          <w:b/>
+        </w:rPr>
+        <w:t xml:space="preserve">Word count:</w:t>
+      </w:r>
+      <w:r>
+        <w:t xml:space="preserve"> ~1,490 (AI disclosure included; code blocks excluded). </w:t>
+      </w:r>
       <w:r>
         <w:rPr>
           <w:b/>
@@ -32,7 +30,7 @@
         <w:t xml:space="preserve">Assumptions:</w:t>
       </w:r>
       <w:r>
-        <w:t xml:space="preserve"> fictional data, UTC timestamps, Snowflake SQL. Code is abridged and excluded from the word count; full code and tests are at </w:t>
+        <w:t xml:space="preserve"> fictional data, UTC timestamps, Snowflake SQL. Code is abridged; full code and tests: </w:t>
       </w:r>
       <w:hyperlink r:id="rIdLink1">
         <w:r>
@@ -74,7 +72,7 @@
         <w:t xml:space="preserve">Goal:</w:t>
       </w:r>
       <w:r>
-        <w:t xml:space="preserve"> one row per user, so the PM can build the funnel without joins.</w:t>
+        <w:t xml:space="preserve"> one row per user, so the PM can see which step leaks most for each sign-up cohort, without joins.</w:t>
       </w:r>
     </w:p>
     <w:p>
@@ -191,7 +189,27 @@
                 <w:rFonts w:ascii="Courier New" w:hAnsi="Courier New" w:cs="Courier New"/>
                 <w:shd w:val="clear" w:color="auto" w:fill="F0F2F5"/>
               </w:rPr>
-              <w:t xml:space="preserve">stg_onboarding_events</w:t>
+              <w:t xml:space="preserve">stg_app</w:t>
+            </w:r>
+            <w:r>
+              <w:t xml:space="preserve">, </w:t>
+            </w:r>
+            <w:r>
+              <w:rPr>
+                <w:rFonts w:ascii="Courier New" w:hAnsi="Courier New" w:cs="Courier New"/>
+                <w:shd w:val="clear" w:color="auto" w:fill="F0F2F5"/>
+              </w:rPr>
+              <w:t xml:space="preserve">stg_kyc</w:t>
+            </w:r>
+            <w:r>
+              <w:t xml:space="preserve">, </w:t>
+            </w:r>
+            <w:r>
+              <w:rPr>
+                <w:rFonts w:ascii="Courier New" w:hAnsi="Courier New" w:cs="Courier New"/>
+                <w:shd w:val="clear" w:color="auto" w:fill="F0F2F5"/>
+              </w:rPr>
+              <w:t xml:space="preserve">stg_ledger</w:t>
             </w:r>
           </w:p>
         </w:tc>
@@ -219,7 +237,7 @@
               <w:keepNext/>
             </w:pPr>
             <w:r>
-              <w:t xml:space="preserve">Cast timestamps to UTC, </w:t>
+              <w:t xml:space="preserve">One per source table, same output: UTC timestamps, </w:t>
             </w:r>
             <w:r>
               <w:rPr>
@@ -229,7 +247,14 @@
               <w:t xml:space="preserve">lower(trim())</w:t>
             </w:r>
             <w:r>
-              <w:t xml:space="preserve"> IDs, map events to 5 steps</w:t>
+              <w:t xml:space="preserve"> IDs, 5 steps; unioned as </w:t>
+            </w:r>
+            <w:r>
+              <w:rPr>
+                <w:rFonts w:ascii="Courier New" w:hAnsi="Courier New" w:cs="Courier New"/>
+                <w:shd w:val="clear" w:color="auto" w:fill="F0F2F5"/>
+              </w:rPr>
+              <w:t xml:space="preserve">stg_onboarding_events</w:t>
             </w:r>
           </w:p>
         </w:tc>
@@ -510,7 +535,7 @@
         <w:t xml:space="preserve">Timestamps.</w:t>
       </w:r>
       <w:r>
-        <w:t xml:space="preserve"> Each format (epoch, ISO with offset, local time plus timezone column) gets its own parser to </w:t>
+        <w:t xml:space="preserve"> One parser per format (epoch, ISO with offset, local time plus zone column), all to </w:t>
       </w:r>
       <w:r>
         <w:rPr>
@@ -883,7 +908,7 @@
         <w:spacing w:before="0" w:after="0" w:line="240" w:lineRule="auto"/>
       </w:pPr>
       <w:r>
-        <w:t xml:space="preserve">  -- has_missing_step: one clause per step; is_out_of_order: vs ANY earlier step</w:t>
+        <w:t xml:space="preserve">  -- reached_* / has_missing_step: one clause per step (deposit shown); out-of-order: vs ANY step</w:t>
       </w:r>
     </w:p>
     <w:p>
@@ -916,7 +941,7 @@
         <w:spacing w:before="0" w:after="0" w:line="240" w:lineRule="auto"/>
       </w:pPr>
       <w:r>
-        <w:t xml:space="preserve">  -- full model: ex1/fct_onboarding_funnel.sql; SQLite port + 31 tests: ex1/sqlite, ex1/tests</w:t>
+        <w:t xml:space="preserve">  -- full model: ex1/fct_onboarding_funnel.sql; SQLite port + 32 tests: ex1/sqlite, ex1/tests</w:t>
       </w:r>
     </w:p>
     <w:p>
@@ -938,6 +963,93 @@
       </w:pPr>
       <w:r>
         <w:t xml:space="preserve">FULL OUTER JOIN accounts a ON a.user_uuid = p.user_uuid;  -- spine: zero-event users still count</w:t>
+      </w:r>
+    </w:p>
+    <w:p>
+      <w:pPr>
+        <w:pStyle w:val="Code"/>
+        <w:keepNext/>
+        <w:shd w:val="clear" w:color="auto" w:fill="F6F8FA"/>
+        <w:spacing w:before="120" w:after="0" w:line="240" w:lineRule="auto"/>
+      </w:pPr>
+      <w:r>
+        <w:t xml:space="preserve">-- What the PM runs: 7-day conversion by weekly sign-up cohort (tested in ex1/sqlite)</w:t>
+      </w:r>
+    </w:p>
+    <w:p>
+      <w:pPr>
+        <w:pStyle w:val="Code"/>
+        <w:keepNext/>
+        <w:shd w:val="clear" w:color="auto" w:fill="F6F8FA"/>
+        <w:spacing w:before="0" w:after="0" w:line="240" w:lineRule="auto"/>
+      </w:pPr>
+      <w:r>
+        <w:t xml:space="preserve">SELECT DATE_TRUNC('week', signup_at) AS cohort_week, COUNT(*) AS signups,</w:t>
+      </w:r>
+    </w:p>
+    <w:p>
+      <w:pPr>
+        <w:pStyle w:val="Code"/>
+        <w:keepNext/>
+        <w:shd w:val="clear" w:color="auto" w:fill="F6F8FA"/>
+        <w:spacing w:before="0" w:after="0" w:line="240" w:lineRule="auto"/>
+      </w:pPr>
+      <w:r>
+        <w:t xml:space="preserve">       AVG(IFF(COALESCE(first_deposit_at, first_trade_at)          -- a trade implies a deposit</w:t>
+      </w:r>
+    </w:p>
+    <w:p>
+      <w:pPr>
+        <w:pStyle w:val="Code"/>
+        <w:keepNext/>
+        <w:shd w:val="clear" w:color="auto" w:fill="F6F8FA"/>
+        <w:spacing w:before="0" w:after="0" w:line="240" w:lineRule="auto"/>
+      </w:pPr>
+      <w:r>
+        <w:t xml:space="preserve">               &lt; DATEADD('day', 7, signup_at), 1, 0))     AS deposit_7d,</w:t>
+      </w:r>
+    </w:p>
+    <w:p>
+      <w:pPr>
+        <w:pStyle w:val="Code"/>
+        <w:keepNext/>
+        <w:shd w:val="clear" w:color="auto" w:fill="F6F8FA"/>
+        <w:spacing w:before="0" w:after="0" w:line="240" w:lineRule="auto"/>
+      </w:pPr>
+      <w:r>
+        <w:t xml:space="preserve">       AVG(IFF(first_trade_at   &lt; DATEADD('day', 7, signup_at), 1, 0)) AS trade_7d</w:t>
+      </w:r>
+    </w:p>
+    <w:p>
+      <w:pPr>
+        <w:pStyle w:val="Code"/>
+        <w:keepNext/>
+        <w:shd w:val="clear" w:color="auto" w:fill="F6F8FA"/>
+        <w:spacing w:before="0" w:after="0" w:line="240" w:lineRule="auto"/>
+      </w:pPr>
+      <w:r>
+        <w:t xml:space="preserve">FROM fct_onboarding_funnel</w:t>
+      </w:r>
+    </w:p>
+    <w:p>
+      <w:pPr>
+        <w:pStyle w:val="Code"/>
+        <w:keepNext/>
+        <w:shd w:val="clear" w:color="auto" w:fill="F6F8FA"/>
+        <w:spacing w:before="0" w:after="0" w:line="240" w:lineRule="auto"/>
+      </w:pPr>
+      <w:r>
+        <w:t xml:space="preserve">WHERE signup_at &lt; DATEADD('day', -7, CURRENT_TIMESTAMP())       -- immature cohorts excluded</w:t>
+      </w:r>
+    </w:p>
+    <w:p>
+      <w:pPr>
+        <w:pStyle w:val="Code"/>
+        <w:shd w:val="clear" w:color="auto" w:fill="F6F8FA"/>
+        <w:spacing w:before="0" w:after="160" w:line="240" w:lineRule="auto"/>
+      </w:pPr>
+      <w:r>
+        <w:t xml:space="preserve">GROUP BY 1 ORDER BY 1;</w:t>
       </w:r>
     </w:p>
     <w:p>
@@ -1011,7 +1123,27 @@
         <w:t xml:space="preserve">step</w:t>
       </w:r>
       <w:r>
-        <w:t xml:space="preserve"> values.</w:t>
+        <w:t xml:space="preserve"> values; </w:t>
+      </w:r>
+      <w:r>
+        <w:rPr>
+          <w:rFonts w:ascii="Courier New" w:hAnsi="Courier New" w:cs="Courier New"/>
+          <w:shd w:val="clear" w:color="auto" w:fill="F0F2F5"/>
+        </w:rPr>
+        <w:t xml:space="preserve">user_ref</w:t>
+      </w:r>
+      <w:r>
+        <w:t xml:space="preserve"> unique in </w:t>
+      </w:r>
+      <w:r>
+        <w:rPr>
+          <w:rFonts w:ascii="Courier New" w:hAnsi="Courier New" w:cs="Courier New"/>
+          <w:shd w:val="clear" w:color="auto" w:fill="F0F2F5"/>
+        </w:rPr>
+        <w:t xml:space="preserve">int_identity_map</w:t>
+      </w:r>
+      <w:r>
+        <w:t xml:space="preserve">.</w:t>
       </w:r>
     </w:p>
     <w:p>
@@ -1093,7 +1225,7 @@
         <w:t xml:space="preserve">Verified</w:t>
       </w:r>
       <w:r>
-        <w:t xml:space="preserve"> in SQLite on 15 hand-built messy users (mixed ID case, offsets, epochs, DST, replays, gaps) plus 400 generated; every check fires when its fault is planted. Testing caught first-draft bugs, now pinned as regression tests, e.g. upper-case UUIDs losing deposits.</w:t>
+        <w:t xml:space="preserve"> in SQLite on 15 messy users plus 400 generated; every check fires when its fault is planted. Testing caught real first-draft bugs (upper-case UUIDs lost deposits), now regression tests.</w:t>
       </w:r>
     </w:p>
     <w:p>
@@ -1132,7 +1264,16 @@
         <w:t xml:space="preserve">grain</w:t>
       </w:r>
       <w:r>
-        <w:t xml:space="preserve"> before comparing totals, starting with C's duplicate IDs. I built synthetic CSVs (A 52,000, B 45,000, C 57,000 rows) with planted problems; the script finds them blind; 13 unit tests confirm exact recovery, including malformed rows and DST.</w:t>
+        <w:t xml:space="preserve"> before comparing totals, starting with C's duplicate IDs. </w:t>
+      </w:r>
+      <w:r>
+        <w:rPr>
+          <w:b/>
+        </w:rPr>
+        <w:t xml:space="preserve">Two hours:</w:t>
+      </w:r>
+      <w:r>
+        <w:t xml:space="preserve"> 30 min on grain and duplicates, 60 confirming definitions with system owners, 30 on the PM note. To test the script, I planted the usual suspects (replays, timezone windows, filters) in synthetic 52K/45K/57K extracts.</w:t>
       </w:r>
     </w:p>
     <w:p>
@@ -1302,6 +1443,46 @@
         <w:spacing w:before="0" w:after="0" w:line="240" w:lineRule="auto"/>
       </w:pPr>
       <w:r>
+        <w:t xml:space="preserve">            if not r["uid"]:</w:t>
+      </w:r>
+    </w:p>
+    <w:p>
+      <w:pPr>
+        <w:pStyle w:val="Code"/>
+        <w:shd w:val="clear" w:color="auto" w:fill="F6F8FA"/>
+        <w:spacing w:before="0" w:after="0" w:line="240" w:lineRule="auto"/>
+      </w:pPr>
+      <w:r>
+        <w:t xml:space="preserve">                bad["blank user_id"] += 1</w:t>
+      </w:r>
+    </w:p>
+    <w:p>
+      <w:pPr>
+        <w:pStyle w:val="Code"/>
+        <w:shd w:val="clear" w:color="auto" w:fill="F6F8FA"/>
+        <w:spacing w:before="0" w:after="0" w:line="240" w:lineRule="auto"/>
+      </w:pPr>
+      <w:r>
+        <w:t xml:space="preserve">            elif r["ts_utc"] is None:</w:t>
+      </w:r>
+    </w:p>
+    <w:p>
+      <w:pPr>
+        <w:pStyle w:val="Code"/>
+        <w:shd w:val="clear" w:color="auto" w:fill="F6F8FA"/>
+        <w:spacing w:before="0" w:after="0" w:line="240" w:lineRule="auto"/>
+      </w:pPr>
+      <w:r>
+        <w:t xml:space="preserve">                bad["unparseable timestamp"] += 1</w:t>
+      </w:r>
+    </w:p>
+    <w:p>
+      <w:pPr>
+        <w:pStyle w:val="Code"/>
+        <w:shd w:val="clear" w:color="auto" w:fill="F6F8FA"/>
+        <w:spacing w:before="0" w:after="0" w:line="240" w:lineRule="auto"/>
+      </w:pPr>
+      <w:r>
         <w:t xml:space="preserve">    ...</w:t>
       </w:r>
     </w:p>
@@ -1679,7 +1860,7 @@
         <w:rPr>
           <w:b/>
         </w:rPr>
-        <w:t xml:space="preserve">How I'd investigate the root causes (cheapest to confirm first)</w:t>
+        <w:t xml:space="preserve">What the synthetic run shows, and how I'd confirm each on real data (cheapest first)</w:t>
       </w:r>
     </w:p>
     <w:p>
@@ -1727,7 +1908,7 @@
         <w:t xml:space="preserve">_retry2</w:t>
       </w:r>
       <w:r>
-        <w:t xml:space="preserve"> copies of the six 13:00–16:00 UTC batches (b26–b31): replayed ingestion. Deduplicated, C's IDs match A's. I'd confirm with the pipeline owner and request an upstream uniqueness test.</w:t>
+        <w:t xml:space="preserve"> copies of six 13:00–16:00 UTC batches (b26–b31, hence 12 replay batches): replayed ingestion. Deduplicated, C's IDs match A's. I'd confirm with the pipeline owner and request an upstream uniqueness test.</w:t>
       </w:r>
     </w:p>
     <w:p>
@@ -1818,7 +1999,7 @@
         <w:t xml:space="preserve">50,000 new accounts</w:t>
       </w:r>
       <w:r>
-        <w:t xml:space="preserve"> (created on 9/24 UTC, excluding internal/test accounts). The systems aren't disagreeing about facts; they count different things: C double-counts replayed batches, B uses Pacific time and only counts email-verified users (43.3K of the 50K are verified), and A includes test accounts. I've reconciled all three with zero unexplained users. Suggested footnote: </w:t>
+        <w:t xml:space="preserve"> (created on 9/24 UTC, excluding internal/test accounts). The systems aren't disagreeing about facts; they count different things: C double-counts replayed batches, B uses Pacific time and only counts email-verified users, and A includes test accounts. I've reconciled all three with zero unexplained users. Suggested footnote: </w:t>
       </w:r>
       <w:r>
         <w:rPr>
@@ -2147,7 +2328,7 @@
                 <w:rFonts w:ascii="Courier New" w:hAnsi="Courier New" w:cs="Courier New"/>
                 <w:shd w:val="clear" w:color="auto" w:fill="F0F2F5"/>
               </w:rPr>
-              <w:t xml:space="preserve">status = 1 OR 3</w:t>
+              <w:t xml:space="preserve">status = 1 OR status = 3</w:t>
             </w:r>
           </w:p>
         </w:tc>
@@ -2341,17 +2522,7 @@
         <w:pStyle w:val="Normal"/>
       </w:pPr>
       <w:r>
-        <w:t xml:space="preserve">The snippet already groups by country, so the cut is likely lost in a later rollup. Per-country traders sum to the total only if each user has one </w:t>
-      </w:r>
-      <w:r>
-        <w:rPr>
-          <w:rFonts w:ascii="Courier New" w:hAnsi="Courier New" w:cs="Courier New"/>
-          <w:shd w:val="clear" w:color="auto" w:fill="F0F2F5"/>
-        </w:rPr>
-        <w:t xml:space="preserve">users</w:t>
-      </w:r>
-      <w:r>
-        <w:t xml:space="preserve"> row.</w:t>
+        <w:t xml:space="preserve">The snippet already groups by country, so the cut is likely lost in a later rollup.</w:t>
       </w:r>
     </w:p>
     <w:p>
@@ -2381,7 +2552,7 @@
         <w:t xml:space="preserve">Freeze a baseline.</w:t>
       </w:r>
       <w:r>
-        <w:t xml:space="preserve"> Snapshot 12 weeks.</w:t>
+        <w:t xml:space="preserve"> Snapshot 12 weeks so any change is measurable, not arguable.</w:t>
       </w:r>
     </w:p>
     <w:p>
@@ -2452,6 +2623,9 @@
         </w:rPr>
         <w:t xml:space="preserve">"Legacy definition; known issues in DATA-123."</w:t>
       </w:r>
+      <w:r>
+        <w:t xml:space="preserve"> The PM gets the cut before Friday; nobody's number moves silently.</w:t>
+      </w:r>
     </w:p>
     <w:p>
       <w:pPr>
@@ -2492,7 +2666,7 @@
         <w:t xml:space="preserve">To the PM:</w:t>
       </w:r>
       <w:r>
-        <w:t xml:space="preserve"> "Country cut by Thursday, matching last week's total. Caveat: multi-device users inflate trade counts (the 41% issue) and web-only traders are missing; fixes follow the review."</w:t>
+        <w:t xml:space="preserve"> "Country cut by Thursday, matching last week's total. Present trader counts, not trade counts, which multi-device users inflate (the 41% issue); web-only traders are missing. Fixes follow the review."</w:t>
       </w:r>
     </w:p>
     <w:p>
@@ -2500,7 +2674,7 @@
         <w:pStyle w:val="Normal"/>
       </w:pPr>
       <w:r>
-        <w:t xml:space="preserve">Verified on a 7-user SQLite fixture: legacy reports 11 completed trades against 8 real; its trader total matches only because errors cancel.</w:t>
+        <w:t xml:space="preserve">Verified on a 7-user SQLite fixture: legacy reports 11 completed trades against 8 real; its trader total matches only because dropped web-only traders offset counted failed-only ones.</w:t>
       </w:r>
     </w:p>
     <w:p>
@@ -2544,7 +2718,7 @@
         <w:spacing w:before="0" w:after="0" w:line="240" w:lineRule="auto"/>
       </w:pPr>
       <w:r>
-        <w:t xml:space="preserve">         -- created_at converted to UTC; WEEK_START = 1 (Monday)</w:t>
+        <w:t xml:space="preserve">         -- assumes created_at is TIMESTAMP_TZ (if NTZ: 3-arg CONVERT_TIMEZONE); WEEK_START = 1</w:t>
       </w:r>
     </w:p>
     <w:p>
@@ -2676,7 +2850,7 @@
         <w:spacing w:before="0" w:after="0" w:line="240" w:lineRule="auto"/>
       </w:pPr>
       <w:r>
-        <w:t xml:space="preserve">LEFT JOIN dim_user u ON u.user_id = w.user_id    -- earliest users row: 1 row per user (tested)</w:t>
+        <w:t xml:space="preserve">LEFT JOIN dim_user u ON u.user_id = w.user_id    -- sign-up country (owner to confirm); 1 row/user</w:t>
       </w:r>
     </w:p>
     <w:p>
@@ -2794,7 +2968,7 @@
         <w:t xml:space="preserve">users</w:t>
       </w:r>
       <w:r>
-        <w:t xml:space="preserve">, so it isn't a share of users. Before talking to the PM, I reproduce both from my model: user-device pairs give 41%, users give 34%. The gap is Exercise 3's fan-out (a 100-user fixture confirms: 7 two-device traders turn 34% into 41%).</w:t>
+        <w:t xml:space="preserve">, so it isn't a share of users. I first reproduce both from my model: user-device pairs give 41%, users give 34%. The gap is Exercise 3's fan-out (a 100-user fixture confirms: 7 two-device traders turn 34% into 41%).</w:t>
       </w:r>
     </w:p>
     <w:p>
@@ -2988,7 +3162,7 @@
         <w:t xml:space="preserve">Run both in parallel</w:t>
       </w:r>
       <w:r>
-        <w:t xml:space="preserve">, clearly labeled, for about 2 review cycles.</w:t>
+        <w:t xml:space="preserve">, clearly labeled, for about 2 review cycles, so the gap is understood before the switch.</w:t>
       </w:r>
     </w:p>
     <w:p>

</xml_diff>

<commit_message>
Fix pre-sign-up trade window edge case, add status lookup check, enforce word limit, tighten submission
</commit_message>
<xml_diff>
--- a/submission.docx
+++ b/submission.docx
@@ -21,7 +21,7 @@
         <w:t xml:space="preserve">Armaan Singla</w:t>
       </w:r>
       <w:r>
-        <w:t xml:space="preserve"> · ~1,460 words (headings, tables and AI disclosure included; code excluded)</w:t>
+        <w:t xml:space="preserve"> · ~1,395 words (headings, tables and AI disclosure included; code excluded)</w:t>
       </w:r>
     </w:p>
     <w:p>
@@ -35,7 +35,7 @@
         <w:t xml:space="preserve">Note:</w:t>
       </w:r>
       <w:r>
-        <w:t xml:space="preserve"> fictional scenarios, synthetic data. The SQL is written for Snowflake but was run only through a SQLite port. Code and tests: </w:t>
+        <w:t xml:space="preserve"> fictional scenarios, synthetic data; SQL written for Snowflake but run only through a SQLite port. Code and tests: </w:t>
       </w:r>
       <w:hyperlink r:id="rIdLink1">
         <w:r>
@@ -480,7 +480,7 @@
         <w:t xml:space="preserve">to</w:t>
       </w:r>
       <w:r>
-        <w:t xml:space="preserve"> it through deterministic links. UUIDs compare case-insensitively, but device IDs match exactly, since IDs differing only by case can be different devices. A ref pointing to two accounts is quarantined, not guessed. At Scotiabank, connecting NPS feedback with login telemetry across 337 outage cases taught me to confirm two records share a user and time window before trusting a join, and to study what didn't match.</w:t>
+        <w:t xml:space="preserve"> it through deterministic links. UUIDs compare case-insensitively; device IDs match exactly. A ref pointing to two accounts is quarantined, not guessed. At Scotiabank, connecting NPS feedback with login telemetry across 337 outage cases taught me to confirm two records share a user and time window before trusting a join, and to study what didn't match.</w:t>
       </w:r>
     </w:p>
     <w:p>
@@ -513,7 +513,7 @@
         <w:t xml:space="preserve">observed</w:t>
       </w:r>
       <w:r>
-        <w:t xml:space="preserve">: the source system recorded it.</w:t>
+        <w:t xml:space="preserve">: recorded by the source.</w:t>
       </w:r>
     </w:p>
     <w:p>
@@ -570,7 +570,7 @@
         <w:t xml:space="preserve">not_reached</w:t>
       </w:r>
       <w:r>
-        <w:t xml:space="preserve">: no evidence the user got there.</w:t>
+        <w:t xml:space="preserve">: no evidence.</w:t>
       </w:r>
     </w:p>
     <w:p>
@@ -604,7 +604,7 @@
         <w:pStyle w:val="Normal"/>
       </w:pPr>
       <w:r>
-        <w:t xml:space="preserve">Step states show where users stop; for 7-day funding and trading, the PM runs:</w:t>
+        <w:t xml:space="preserve">Step states show where users stop; for 7-day funding, the PM runs:</w:t>
       </w:r>
     </w:p>
     <w:p>
@@ -615,6 +615,17 @@
         <w:spacing w:before="120" w:after="0" w:line="240" w:lineRule="auto"/>
       </w:pPr>
       <w:r>
+        <w:t xml:space="preserve">-- ex1/pm_funnel_query.sql (complete query; header comments omitted)</w:t>
+      </w:r>
+    </w:p>
+    <w:p>
+      <w:pPr>
+        <w:pStyle w:val="Code"/>
+        <w:keepNext/>
+        <w:shd w:val="clear" w:color="auto" w:fill="F6F8FA"/>
+        <w:spacing w:before="0" w:after="0" w:line="240" w:lineRule="auto"/>
+      </w:pPr>
+      <w:r>
         <w:t xml:space="preserve">WITH users AS (</w:t>
       </w:r>
     </w:p>
@@ -637,51 +648,51 @@
         <w:spacing w:before="0" w:after="0" w:line="240" w:lineRule="auto"/>
       </w:pPr>
       <w:r>
-        <w:t xml:space="preserve">        DATEADD('day', 1 - DAYOFWEEKISO(signup_at), DATE(signup_at))    AS cohort_week,</w:t>
-      </w:r>
-    </w:p>
-    <w:p>
-      <w:pPr>
-        <w:pStyle w:val="Code"/>
-        <w:keepNext/>
-        <w:shd w:val="clear" w:color="auto" w:fill="F6F8FA"/>
-        <w:spacing w:before="0" w:after="0" w:line="240" w:lineRule="auto"/>
-      </w:pPr>
-      <w:r>
-        <w:t xml:space="preserve">        COALESCE(first_deposit_at &gt;= signup_at</w:t>
-      </w:r>
-    </w:p>
-    <w:p>
-      <w:pPr>
-        <w:pStyle w:val="Code"/>
-        <w:keepNext/>
-        <w:shd w:val="clear" w:color="auto" w:fill="F6F8FA"/>
-        <w:spacing w:before="0" w:after="0" w:line="240" w:lineRule="auto"/>
-      </w:pPr>
-      <w:r>
-        <w:t xml:space="preserve">             AND first_deposit_at &lt; DATEADD('day', 7, signup_at), FALSE) AS deposit_in_7d,</w:t>
-      </w:r>
-    </w:p>
-    <w:p>
-      <w:pPr>
-        <w:pStyle w:val="Code"/>
-        <w:keepNext/>
-        <w:shd w:val="clear" w:color="auto" w:fill="F6F8FA"/>
-        <w:spacing w:before="0" w:after="0" w:line="240" w:lineRule="auto"/>
-      </w:pPr>
-      <w:r>
-        <w:t xml:space="preserve">        COALESCE(first_trade_at &gt;= signup_at</w:t>
-      </w:r>
-    </w:p>
-    <w:p>
-      <w:pPr>
-        <w:pStyle w:val="Code"/>
-        <w:keepNext/>
-        <w:shd w:val="clear" w:color="auto" w:fill="F6F8FA"/>
-        <w:spacing w:before="0" w:after="0" w:line="240" w:lineRule="auto"/>
-      </w:pPr>
-      <w:r>
-        <w:t xml:space="preserve">             AND first_trade_at &lt; DATEADD('day', 7, signup_at), FALSE)   AS trade_in_7d</w:t>
+        <w:t xml:space="preserve">        DATEADD('day', 1 - DAYOFWEEKISO(signup_at), DATE(signup_at))  AS cohort_week,</w:t>
+      </w:r>
+    </w:p>
+    <w:p>
+      <w:pPr>
+        <w:pStyle w:val="Code"/>
+        <w:keepNext/>
+        <w:shd w:val="clear" w:color="auto" w:fill="F6F8FA"/>
+        <w:spacing w:before="0" w:after="0" w:line="240" w:lineRule="auto"/>
+      </w:pPr>
+      <w:r>
+        <w:t xml:space="preserve">        COALESCE(first_deposit_after_signup_at                  -- &gt;= signup_at by construction</w:t>
+      </w:r>
+    </w:p>
+    <w:p>
+      <w:pPr>
+        <w:pStyle w:val="Code"/>
+        <w:keepNext/>
+        <w:shd w:val="clear" w:color="auto" w:fill="F6F8FA"/>
+        <w:spacing w:before="0" w:after="0" w:line="240" w:lineRule="auto"/>
+      </w:pPr>
+      <w:r>
+        <w:t xml:space="preserve">                 &lt; DATEADD('day', 7, signup_at), FALSE)                AS deposit_in_7d,</w:t>
+      </w:r>
+    </w:p>
+    <w:p>
+      <w:pPr>
+        <w:pStyle w:val="Code"/>
+        <w:keepNext/>
+        <w:shd w:val="clear" w:color="auto" w:fill="F6F8FA"/>
+        <w:spacing w:before="0" w:after="0" w:line="240" w:lineRule="auto"/>
+      </w:pPr>
+      <w:r>
+        <w:t xml:space="preserve">        COALESCE(first_trade_after_signup_at</w:t>
+      </w:r>
+    </w:p>
+    <w:p>
+      <w:pPr>
+        <w:pStyle w:val="Code"/>
+        <w:keepNext/>
+        <w:shd w:val="clear" w:color="auto" w:fill="F6F8FA"/>
+        <w:spacing w:before="0" w:after="0" w:line="240" w:lineRule="auto"/>
+      </w:pPr>
+      <w:r>
+        <w:t xml:space="preserve">                 &lt; DATEADD('day', 7, signup_at), FALSE)                AS trade_in_7d</w:t>
       </w:r>
     </w:p>
     <w:p>
@@ -819,7 +830,16 @@
         <w:t xml:space="preserve">[signup, signup + 7 days)</w:t>
       </w:r>
       <w:r>
-        <w:t xml:space="preserve">. A week appears only once all its users have had 7 full days, and the Monday week ignores Snowflake's </w:t>
+        <w:t xml:space="preserve">, on the earliest deposit or trade </w:t>
+      </w:r>
+      <w:r>
+        <w:rPr>
+          <w:i/>
+        </w:rPr>
+        <w:t xml:space="preserve">at or after</w:t>
+      </w:r>
+      <w:r>
+        <w:t xml:space="preserve"> sign-up, so a pre-sign-up trade can't hide a valid one; original timestamps stay for audit. Weeks appear once all their users have had 7 days; the Monday week ignores </w:t>
       </w:r>
       <w:r>
         <w:rPr>
@@ -829,7 +849,7 @@
         <w:t xml:space="preserve">WEEK_START</w:t>
       </w:r>
       <w:r>
-        <w:t xml:space="preserve"> setting.</w:t>
+        <w:t xml:space="preserve">.</w:t>
       </w:r>
     </w:p>
     <w:p>
@@ -843,7 +863,7 @@
         <w:t xml:space="preserve">Checks:</w:t>
       </w:r>
       <w:r>
-        <w:t xml:space="preserve"> unique grain, ≥ 99% identity match (staged = used + quarantined), one UUID per </w:t>
+        <w:t xml:space="preserve"> unique grain; ≥ 99% identity match (staged = used + quarantined); one UUID per </w:t>
       </w:r>
       <w:r>
         <w:rPr>
@@ -853,7 +873,7 @@
         <w:t xml:space="preserve">account_id</w:t>
       </w:r>
       <w:r>
-        <w:t xml:space="preserve">, sign-ups vs. accounts within 0.5% daily, no future or pre-2012 timestamps, freshness under 6h, alerts on out-of-order or assumed-UTC spikes.</w:t>
+        <w:t xml:space="preserve">; sign-ups within 0.5% of accounts daily; timestamp sanity; freshness under 6h; out-of-order and assumed-UTC alerts.</w:t>
       </w:r>
     </w:p>
     <w:p>
@@ -867,7 +887,7 @@
         <w:t xml:space="preserve">Tested</w:t>
       </w:r>
       <w:r>
-        <w:t xml:space="preserve"> with 55 SQLite tests, including hand-calculated edge cases (a day-2 trade with a day-8 deposit is funded; a trade before sign-up or at exactly day 7 isn't) and metamorphic tests (duplicates, extra devices, reordering, reruns).</w:t>
+        <w:t xml:space="preserve"> with 57 SQLite tests, including hand-calculated edge cases (day-2 trade with day-8 deposit, trades before sign-up, the exact day-7 boundary) and metamorphic tests.</w:t>
       </w:r>
     </w:p>
     <w:p>
@@ -985,7 +1005,7 @@
         <w:pStyle w:val="Normal"/>
       </w:pPr>
       <w:r>
-        <w:t xml:space="preserve">I tested the script on synthetic extracts with planted causes. That proves the method, not what's true at Coinbase:</w:t>
+        <w:t xml:space="preserve">Synthetic extracts with planted causes test the method, not what's true at Coinbase:</w:t>
       </w:r>
     </w:p>
     <w:tbl>
@@ -1187,6 +1207,17 @@
         <w:spacing w:before="120" w:after="0" w:line="240" w:lineRule="auto"/>
       </w:pPr>
       <w:r>
+        <w:t xml:space="preserve"># Excerpt: why_not_in_b() in ex2/reconcile_signups.py</w:t>
+      </w:r>
+    </w:p>
+    <w:p>
+      <w:pPr>
+        <w:pStyle w:val="Code"/>
+        <w:keepNext/>
+        <w:shd w:val="clear" w:color="auto" w:fill="F6F8FA"/>
+        <w:spacing w:before="0" w:after="0" w:line="240" w:lineRule="auto"/>
+      </w:pPr>
+      <w:r>
         <w:t xml:space="preserve">    checks = [(OUTSIDE, not in_window(ts, utc_day)),</w:t>
       </w:r>
     </w:p>
@@ -1405,7 +1436,7 @@
         <w:pStyle w:val="Normal"/>
       </w:pPr>
       <w:r>
-        <w:t xml:space="preserve">Each user gets one reason in a fixed order; the overlap lines show 1,815 users matched several, so the buckets aren't independent causes.</w:t>
+        <w:t xml:space="preserve">Each user gets one reason in a fixed order; 1,815 matched several, so the buckets aren't independent causes.</w:t>
       </w:r>
     </w:p>
     <w:p>
@@ -1430,7 +1461,7 @@
         <w:ind w:left="360"/>
       </w:pPr>
       <w:r>
-        <w:t xml:space="preserve">"Hey, I looked into why the three signup numbers don't match. I know you need one number for Friday. They seem to count different things: C seems to have duplicate rows, and B seems to use a Pacific-time day and count only verified users. I'd define signups as </w:t>
+        <w:t xml:space="preserve">"Hey, I looked into why the three signup numbers don't match. I know you need one number for Friday. They seem to count different things: C looks like it has duplicate rows, and B a Pacific-time day with only verified users. I'd define signups as </w:t>
       </w:r>
       <w:r>
         <w:rPr>
@@ -1439,7 +1470,7 @@
         <w:t xml:space="preserve">accounts created on the UTC day, excluding internal test accounts</w:t>
       </w:r>
       <w:r>
-        <w:t xml:space="preserve">. I'm confirming the causes with each system's owner by Thursday noon. If confirmed, that number goes in the deck with the definition footnoted. If not, we use A's 52K labeled 'accounts created, filters unconfirmed, under review.'"</w:t>
+        <w:t xml:space="preserve">. I'm confirming the causes with each system's owner by Thursday noon. If confirmed, it goes in the deck with the definition footnoted. If not, we use A's 52K labeled 'accounts created, filters unconfirmed, under review.'"</w:t>
       </w:r>
     </w:p>
     <w:p>
@@ -1483,7 +1514,7 @@
         <w:t xml:space="preserve">What matters:</w:t>
       </w:r>
       <w:r>
-        <w:t xml:space="preserve"> the PM needs a country view by Friday, and other dashboards rely on this metric. The snippet already groups by country, so the view is probably lost downstream (a rollup, semantic layer or dashboard); I'd find that first.</w:t>
+        <w:t xml:space="preserve"> the PM needs a country view by Friday, and other dashboards rely on this metric. The snippet already groups by country, so the view is probably lost downstream (rollup, semantic layer or dashboard); I'd find that first.</w:t>
       </w:r>
     </w:p>
     <w:tbl>
@@ -1674,7 +1705,7 @@
               <w:pStyle w:val="TableText"/>
             </w:pPr>
             <w:r>
-              <w:t xml:space="preserve">Inner join drops traders with no active device; current state, so past weeks change on rerun</w:t>
+              <w:t xml:space="preserve">Drops traders with no active device; current state, so reruns change past weeks</w:t>
             </w:r>
           </w:p>
         </w:tc>
@@ -1920,7 +1951,7 @@
         </w:numPr>
       </w:pPr>
       <w:r>
-        <w:t xml:space="preserve">Snapshot recent weeks and find every dashboard that reads this table.</w:t>
+        <w:t xml:space="preserve">Snapshot recent weeks; find every dashboard reading this table.</w:t>
       </w:r>
     </w:p>
     <w:p>
@@ -1968,7 +1999,7 @@
         <w:t xml:space="preserve">Friday:</w:t>
       </w:r>
       <w:r>
-        <w:t xml:space="preserve"> country on the legacy logic, unchanged. Trade counts add up across countries; distinct traders don't when a user has several country rows (my fixture: 9 by country vs. 7 global). It ships with a reconciliation line, not a promise to match.</w:t>
+        <w:t xml:space="preserve"> country on unchanged legacy logic, with a reconciliation line: trade counts add up across countries, but distinct traders don't when a user has several country rows (fixture: 9 vs. 7 global).</w:t>
       </w:r>
     </w:p>
     <w:p>
@@ -2003,6 +2034,17 @@
         <w:spacing w:before="120" w:after="0" w:line="240" w:lineRule="auto"/>
       </w:pPr>
       <w:r>
+        <w:t xml:space="preserve">-- Excerpt: one CTE from ex3/v2_fct_user_week_trades.sql</w:t>
+      </w:r>
+    </w:p>
+    <w:p>
+      <w:pPr>
+        <w:pStyle w:val="Code"/>
+        <w:keepNext/>
+        <w:shd w:val="clear" w:color="auto" w:fill="F6F8FA"/>
+        <w:spacing w:before="0" w:after="0" w:line="240" w:lineRule="auto"/>
+      </w:pPr>
+      <w:r>
         <w:t xml:space="preserve">), country_as_of_first_completed AS (</w:t>
       </w:r>
     </w:p>
@@ -2129,7 +2171,7 @@
         <w:t xml:space="preserve">Using AI:</w:t>
       </w:r>
       <w:r>
-        <w:t xml:space="preserve"> to explain the 400 lines, map dependencies and draft tests; verified by diffing old vs. new at every grain, hand-tracing edge cases and confirming status codes with the owners.</w:t>
+        <w:t xml:space="preserve"> to explain the 400 lines, map dependencies and draft tests; verified by diffing old vs. new at every grain, hand-tracing edge cases and confirming status codes with owners.</w:t>
       </w:r>
     </w:p>
     <w:p>
@@ -2159,7 +2201,7 @@
         <w:t xml:space="preserve">First, what are we counting?</w:t>
       </w:r>
       <w:r>
-        <w:t xml:space="preserve"> The brief says the 41% counts multi-device traders more than once, matching the fan-out from Exercise 3. I'd confirm by deduplicating the numerator to users: landing at 34% explains the whole gap; otherwise I check the residual:</w:t>
+        <w:t xml:space="preserve"> The brief says the legacy 41% "double-counts users who trade on multiple devices," a device-grain issue akin to Exercise 3's join. I'd confirm by deduplicating the numerator to users. If that reproduces 34%, the stated cause accounts for the gap; if not, I check the residual:</w:t>
       </w:r>
     </w:p>
     <w:tbl>
@@ -2274,7 +2316,7 @@
               <w:keepNext/>
             </w:pPr>
             <w:r>
-              <w:t xml:space="preserve">Rows per user in the numerator</w:t>
+              <w:t xml:space="preserve">Rows per user</w:t>
             </w:r>
           </w:p>
         </w:tc>
@@ -2518,14 +2560,6 @@
       <w:pPr>
         <w:spacing w:after="0"/>
       </w:pPr>
-    </w:p>
-    <w:p>
-      <w:pPr>
-        <w:pStyle w:val="Normal"/>
-      </w:pPr>
-      <w:r>
-        <w:t xml:space="preserve">On synthetic data, three of these can each produce the same gap, so sizing matters.</w:t>
-      </w:r>
     </w:p>
     <w:p>
       <w:pPr>
@@ -2549,7 +2583,7 @@
         <w:ind w:left="360"/>
       </w:pPr>
       <w:r>
-        <w:t xml:space="preserve">"Can we talk before the review? I get why a discrepancy in the deck is stressful, and I'm not trying to make your job harder. The dashboard counts a trader once per device; mine counts each person once. My worry is leadership making a call on a number we think might be off, because once it's in a report people build on it. Making my table match wouldn't make either number right. I'd rather we explain the difference now than explain later why we used it."</w:t>
+        <w:t xml:space="preserve">"Can we talk before the review? I get why a discrepancy in the deck is stressful, and I'm not trying to make your job harder. The dashboard counts some traders once per device; mine counts each person once. My worry is leadership making a call on a number we think might be off, because once it's in a report people build on it. Making my table match wouldn't make either number right. I'd rather we explain the difference now than explain later why we used it."</w:t>
       </w:r>
     </w:p>
     <w:p>
@@ -2563,7 +2597,7 @@
         <w:t xml:space="preserve">For Friday:</w:t>
       </w:r>
       <w:r>
-        <w:t xml:space="preserve"> if Thursday's check lands at 34%, headline 34% with 41% footnoted as "legacy, counts traders once per device." If a residual remains, show both, clearly labeled, with the gap under review. The PM presents; I don't correct them in the room. If pressed to present a number I know is materially wrong, I'd raise it with my manager.</w:t>
+        <w:t xml:space="preserve"> if Thursday's check lands at 34%, headline 34% with 41% footnoted as "legacy, double-counts multi-device traders." If a residual remains, show both, clearly labeled, with the gap under review. The PM presents; I don't correct them in the room. If pressed to present a number I know is wrong, I'd raise it with my manager.</w:t>
       </w:r>
     </w:p>
     <w:p>
@@ -2577,7 +2611,7 @@
         <w:t xml:space="preserve">After the review:</w:t>
       </w:r>
       <w:r>
-        <w:t xml:space="preserve"> one written definition in the semantic layer (numerator, denominator, grain, filters, timezone, owner), both versions in parallel for two cycles, a check of past decisions near thresholds, restated history with a changelog, and a grain test.</w:t>
+        <w:t xml:space="preserve"> one owned definition in the semantic layer (numerator, denominator, grain, filters, timezone), two cycles in parallel, a review of past decisions near thresholds, restated history with a changelog, and a grain test.</w:t>
       </w:r>
     </w:p>
     <w:p>

</xml_diff>

<commit_message>
Normalize compact timestamp offsets, default COUNT_IF to 0, clarify Exercise 4 and funding assumptions
</commit_message>
<xml_diff>
--- a/submission.docx
+++ b/submission.docx
@@ -21,7 +21,7 @@
         <w:t xml:space="preserve">Armaan Singla</w:t>
       </w:r>
       <w:r>
-        <w:t xml:space="preserve"> · ~1,395 words (headings, tables and AI disclosure included; code excluded)</w:t>
+        <w:t xml:space="preserve"> · ~1,380 words (headings, tables and AI disclosure included; code excluded)</w:t>
       </w:r>
     </w:p>
     <w:p>
@@ -578,16 +578,7 @@
         <w:pStyle w:val="Normal"/>
       </w:pPr>
       <w:r>
-        <w:t xml:space="preserve">A trade does </w:t>
-      </w:r>
-      <w:r>
-        <w:rPr>
-          <w:b/>
-        </w:rPr>
-        <w:t xml:space="preserve">not</w:t>
-      </w:r>
-      <w:r>
-        <w:t xml:space="preserve"> imply a deposit (card buys are a real alternate route), so funding = deposit </w:t>
+        <w:t xml:space="preserve">I model deposits and trades as separate funding routes (product to confirm), so funding = deposit </w:t>
       </w:r>
       <w:r>
         <w:rPr>
@@ -659,7 +650,7 @@
         <w:spacing w:before="0" w:after="0" w:line="240" w:lineRule="auto"/>
       </w:pPr>
       <w:r>
-        <w:t xml:space="preserve">        COALESCE(first_deposit_after_signup_at                  -- &gt;= signup_at by construction</w:t>
+        <w:t xml:space="preserve">        COALESCE(first_deposit_after_signup_at  -- &gt;= effective signup anchor by construction</w:t>
       </w:r>
     </w:p>
     <w:p>
@@ -736,40 +727,51 @@
         <w:spacing w:before="0" w:after="0" w:line="240" w:lineRule="auto"/>
       </w:pPr>
       <w:r>
-        <w:t xml:space="preserve">       COUNT(*)                                AS signups,</w:t>
-      </w:r>
-    </w:p>
-    <w:p>
-      <w:pPr>
-        <w:pStyle w:val="Code"/>
-        <w:keepNext/>
-        <w:shd w:val="clear" w:color="auto" w:fill="F6F8FA"/>
-        <w:spacing w:before="0" w:after="0" w:line="240" w:lineRule="auto"/>
-      </w:pPr>
-      <w:r>
-        <w:t xml:space="preserve">       COUNT_IF(deposit_in_7d)                 AS observed_deposit_7d,</w:t>
-      </w:r>
-    </w:p>
-    <w:p>
-      <w:pPr>
-        <w:pStyle w:val="Code"/>
-        <w:keepNext/>
-        <w:shd w:val="clear" w:color="auto" w:fill="F6F8FA"/>
-        <w:spacing w:before="0" w:after="0" w:line="240" w:lineRule="auto"/>
-      </w:pPr>
-      <w:r>
-        <w:t xml:space="preserve">       COUNT_IF(deposit_in_7d OR trade_in_7d)  AS funding_7d,</w:t>
-      </w:r>
-    </w:p>
-    <w:p>
-      <w:pPr>
-        <w:pStyle w:val="Code"/>
-        <w:keepNext/>
-        <w:shd w:val="clear" w:color="auto" w:fill="F6F8FA"/>
-        <w:spacing w:before="0" w:after="0" w:line="240" w:lineRule="auto"/>
-      </w:pPr>
-      <w:r>
-        <w:t xml:space="preserve">       COUNT_IF(trade_in_7d)                   AS trade_7d</w:t>
+        <w:t xml:space="preserve">       COUNT(*)                                             AS signups,</w:t>
+      </w:r>
+    </w:p>
+    <w:p>
+      <w:pPr>
+        <w:pStyle w:val="Code"/>
+        <w:keepNext/>
+        <w:shd w:val="clear" w:color="auto" w:fill="F6F8FA"/>
+        <w:spacing w:before="0" w:after="0" w:line="240" w:lineRule="auto"/>
+      </w:pPr>
+      <w:r>
+        <w:t xml:space="preserve">       -- COUNT_IF returns NULL when no row matches, so default each count to 0</w:t>
+      </w:r>
+    </w:p>
+    <w:p>
+      <w:pPr>
+        <w:pStyle w:val="Code"/>
+        <w:keepNext/>
+        <w:shd w:val="clear" w:color="auto" w:fill="F6F8FA"/>
+        <w:spacing w:before="0" w:after="0" w:line="240" w:lineRule="auto"/>
+      </w:pPr>
+      <w:r>
+        <w:t xml:space="preserve">       COALESCE(COUNT_IF(deposit_in_7d), 0)                 AS observed_deposit_7d,</w:t>
+      </w:r>
+    </w:p>
+    <w:p>
+      <w:pPr>
+        <w:pStyle w:val="Code"/>
+        <w:keepNext/>
+        <w:shd w:val="clear" w:color="auto" w:fill="F6F8FA"/>
+        <w:spacing w:before="0" w:after="0" w:line="240" w:lineRule="auto"/>
+      </w:pPr>
+      <w:r>
+        <w:t xml:space="preserve">       COALESCE(COUNT_IF(deposit_in_7d OR trade_in_7d), 0)  AS funding_7d,</w:t>
+      </w:r>
+    </w:p>
+    <w:p>
+      <w:pPr>
+        <w:pStyle w:val="Code"/>
+        <w:keepNext/>
+        <w:shd w:val="clear" w:color="auto" w:fill="F6F8FA"/>
+        <w:spacing w:before="0" w:after="0" w:line="240" w:lineRule="auto"/>
+      </w:pPr>
+      <w:r>
+        <w:t xml:space="preserve">       COALESCE(COUNT_IF(trade_in_7d), 0)                   AS trade_7d</w:t>
       </w:r>
     </w:p>
     <w:p>
@@ -887,7 +889,7 @@
         <w:t xml:space="preserve">Tested</w:t>
       </w:r>
       <w:r>
-        <w:t xml:space="preserve"> with 57 SQLite tests, including hand-calculated edge cases (day-2 trade with day-8 deposit, trades before sign-up, the exact day-7 boundary) and metamorphic tests.</w:t>
+        <w:t xml:space="preserve"> with 58 SQLite tests, including hand-calculated edge cases (day-2 trade with day-8 deposit, trades before sign-up, the exact day-7 boundary) and metamorphic tests.</w:t>
       </w:r>
     </w:p>
     <w:p>
@@ -2201,7 +2203,7 @@
         <w:t xml:space="preserve">First, what are we counting?</w:t>
       </w:r>
       <w:r>
-        <w:t xml:space="preserve"> The brief says the legacy 41% "double-counts users who trade on multiple devices," a device-grain issue akin to Exercise 3's join. I'd confirm by deduplicating the numerator to users. If that reproduces 34%, the stated cause accounts for the gap; if not, I check the residual:</w:t>
+        <w:t xml:space="preserve"> The brief says the legacy 41% "double-counts users who trade on multiple devices," so its numerator counts user-devices while my 34% counts each trader once. That differs from Exercise 3's join, which repeats trades. Before the review I'd still check nothing else differs:</w:t>
       </w:r>
     </w:p>
     <w:tbl>
@@ -2302,7 +2304,7 @@
               <w:keepNext/>
             </w:pPr>
             <w:r>
-              <w:t xml:space="preserve">Device-level numerator</w:t>
+              <w:t xml:space="preserve">Device-level numerator (given)</w:t>
             </w:r>
           </w:p>
         </w:tc>
@@ -2330,7 +2332,7 @@
               <w:keepNext/>
             </w:pPr>
             <w:r>
-              <w:t xml:space="preserve">They explain the gap</w:t>
+              <w:t xml:space="preserve">Deduplicating gives 34%</w:t>
             </w:r>
           </w:p>
         </w:tc>
@@ -2597,7 +2599,7 @@
         <w:t xml:space="preserve">For Friday:</w:t>
       </w:r>
       <w:r>
-        <w:t xml:space="preserve"> if Thursday's check lands at 34%, headline 34% with 41% footnoted as "legacy, double-counts multi-device traders." If a residual remains, show both, clearly labeled, with the gap under review. The PM presents; I don't correct them in the room. If pressed to present a number I know is wrong, I'd raise it with my manager.</w:t>
+        <w:t xml:space="preserve"> headline 34% with 41% footnoted as "legacy, double-counts multi-device traders." If the checks find another difference, the footnote names it too. The PM presents; I don't correct them in the room. If pressed to present a number I know is wrong, I'd raise it with my manager.</w:t>
       </w:r>
     </w:p>
     <w:p>

</xml_diff>